<commit_message>
Update AWS CCP courseware
</commit_message>
<xml_diff>
--- a/courseware/LP-AWS Certified Cloud Practitioner Training.docx
+++ b/courseware/LP-AWS Certified Cloud Practitioner Training.docx
@@ -651,7 +651,7 @@
                 <w:b w:val="0"/>
                 <w:sz w:val="18"/>
               </w:rPr>
-              <w:t>1-14</w:t>
+              <w:t>1-16</w:t>
             </w:r>
           </w:p>
         </w:tc>
@@ -683,7 +683,7 @@
                 <w:b w:val="0"/>
                 <w:sz w:val="18"/>
               </w:rPr>
-              <w:t>16</w:t>
+              <w:t>17</w:t>
             </w:r>
           </w:p>
         </w:tc>
@@ -715,7 +715,7 @@
                 <w:b w:val="0"/>
                 <w:sz w:val="18"/>
               </w:rPr>
-              <w:t>21</w:t>
+              <w:t>22</w:t>
             </w:r>
           </w:p>
         </w:tc>
@@ -747,7 +747,7 @@
                 <w:b w:val="0"/>
                 <w:sz w:val="18"/>
               </w:rPr>
-              <w:t>26</w:t>
+              <w:t>27</w:t>
             </w:r>
           </w:p>
         </w:tc>
@@ -779,7 +779,7 @@
                 <w:b w:val="0"/>
                 <w:sz w:val="18"/>
               </w:rPr>
-              <w:t>31</w:t>
+              <w:t>32</w:t>
             </w:r>
           </w:p>
         </w:tc>
@@ -811,7 +811,7 @@
                 <w:b w:val="0"/>
                 <w:sz w:val="18"/>
               </w:rPr>
-              <w:t>36</w:t>
+              <w:t>37</w:t>
             </w:r>
           </w:p>
         </w:tc>
@@ -843,7 +843,7 @@
                 <w:b w:val="0"/>
                 <w:sz w:val="18"/>
               </w:rPr>
-              <w:t>41</w:t>
+              <w:t>42</w:t>
             </w:r>
           </w:p>
         </w:tc>
@@ -875,7 +875,7 @@
                 <w:b w:val="0"/>
                 <w:sz w:val="18"/>
               </w:rPr>
-              <w:t>46</w:t>
+              <w:t>47</w:t>
             </w:r>
           </w:p>
         </w:tc>
@@ -907,7 +907,7 @@
                 <w:b w:val="0"/>
                 <w:sz w:val="18"/>
               </w:rPr>
-              <w:t>51</w:t>
+              <w:t>52</w:t>
             </w:r>
           </w:p>
         </w:tc>
@@ -939,7 +939,7 @@
                 <w:b w:val="0"/>
                 <w:sz w:val="18"/>
               </w:rPr>
-              <w:t>55-59</w:t>
+              <w:t>56-60</w:t>
             </w:r>
           </w:p>
         </w:tc>
@@ -1120,7 +1120,7 @@
                 <w:b w:val="0"/>
                 <w:sz w:val="18"/>
               </w:rPr>
-              <w:t>1-10</w:t>
+              <w:t>1-16</w:t>
             </w:r>
           </w:p>
         </w:tc>
@@ -1396,7 +1396,7 @@
                 <w:b w:val="0"/>
                 <w:sz w:val="18"/>
               </w:rPr>
-              <w:t>16, 21</w:t>
+              <w:t>17, 22</w:t>
             </w:r>
           </w:p>
         </w:tc>
@@ -1488,7 +1488,7 @@
                 <w:b w:val="0"/>
                 <w:sz w:val="18"/>
               </w:rPr>
-              <w:t>13-14</w:t>
+              <w:t>15-16</w:t>
             </w:r>
           </w:p>
         </w:tc>
@@ -1672,7 +1672,7 @@
                 <w:b w:val="0"/>
                 <w:sz w:val="18"/>
               </w:rPr>
-              <w:t>26, 31</w:t>
+              <w:t>27, 32</w:t>
             </w:r>
           </w:p>
         </w:tc>
@@ -1856,7 +1856,7 @@
                 <w:b w:val="0"/>
                 <w:sz w:val="18"/>
               </w:rPr>
-              <w:t>36</w:t>
+              <w:t>37</w:t>
             </w:r>
           </w:p>
         </w:tc>
@@ -1948,7 +1948,7 @@
                 <w:b w:val="0"/>
                 <w:sz w:val="18"/>
               </w:rPr>
-              <w:t>13-14</w:t>
+              <w:t>15-16</w:t>
             </w:r>
           </w:p>
         </w:tc>
@@ -2040,7 +2040,7 @@
                 <w:b w:val="0"/>
                 <w:sz w:val="18"/>
               </w:rPr>
-              <w:t>1-14</w:t>
+              <w:t>1-16</w:t>
             </w:r>
           </w:p>
         </w:tc>
@@ -2132,7 +2132,7 @@
                 <w:b w:val="0"/>
                 <w:sz w:val="18"/>
               </w:rPr>
-              <w:t>41</w:t>
+              <w:t>42</w:t>
             </w:r>
           </w:p>
         </w:tc>
@@ -2316,7 +2316,7 @@
                 <w:b w:val="0"/>
                 <w:sz w:val="18"/>
               </w:rPr>
-              <w:t>46</w:t>
+              <w:t>47</w:t>
             </w:r>
           </w:p>
         </w:tc>
@@ -2592,7 +2592,7 @@
                 <w:b w:val="0"/>
                 <w:sz w:val="18"/>
               </w:rPr>
-              <w:t>51</w:t>
+              <w:t>52</w:t>
             </w:r>
           </w:p>
         </w:tc>
@@ -2684,7 +2684,7 @@
                 <w:b w:val="0"/>
                 <w:sz w:val="18"/>
               </w:rPr>
-              <w:t>8-9</w:t>
+              <w:t>8-11</w:t>
             </w:r>
           </w:p>
         </w:tc>
@@ -2776,7 +2776,7 @@
                 <w:b w:val="0"/>
                 <w:sz w:val="18"/>
               </w:rPr>
-              <w:t>8-9</w:t>
+              <w:t>8-11</w:t>
             </w:r>
           </w:p>
         </w:tc>
@@ -2868,7 +2868,7 @@
                 <w:b w:val="0"/>
                 <w:sz w:val="18"/>
               </w:rPr>
-              <w:t>57-59</w:t>
+              <w:t>58-60</w:t>
             </w:r>
           </w:p>
         </w:tc>

</xml_diff>